<commit_message>
Record Jun Yang's and Hongqiang Bian's confirmation of full-text decisions D1-D8, Y rule and conflict reading
Status statements only in the full-text guide and decision sheet; no judgement
rule changed. CLAUDE.md logs the author's report and the open items.

Co-Authored-By: Claude Sonnet 5.5 <noreply@anthropic.com>
Claude-Session: https://claude.ai/code/session_01FRD7etKqYN8v2bbXeeLMRW
</commit_message>
<xml_diff>
--- a/Full-text screening - decision sheet D1-D8.docx
+++ b/Full-text screening - decision sheet D1-D8.docx
@@ -16,7 +16,7 @@
           <w:sz w:val="48"/>
           <w:szCs w:val="48"/>
         </w:rPr>
-        <w:t xml:space="preserve">全文筛选：决定表 D1–D8（待确认）</w:t>
+        <w:t xml:space="preserve">全文筛选：决定表 D1–D8</w:t>
       </w:r>
     </w:p>
     <w:p>
@@ -42,7 +42,7 @@
         <w:rPr>
           <w:rFonts w:ascii="Calibri" w:cs="Calibri" w:eastAsia="Microsoft YaHei" w:hAnsi="Calibri"/>
         </w:rPr>
-        <w:t xml:space="preserve">状态：作者（舒俊）已于 2026 年 10 月 17 日决定下列各项，按 Claude 的建议；</w:t>
+        <w:t xml:space="preserve">状态：作者（舒俊）已于 2026 年 10 月 17 日决定下列各项，按 Claude 的建议。</w:t>
       </w:r>
       <w:r>
         <w:rPr>
@@ -50,13 +50,13 @@
           <w:b/>
           <w:bCs/>
         </w:rPr>
-        <w:t xml:space="preserve">杨俊、卞宏强尚未确认</w:t>
+        <w:t xml:space="preserve">2026 年 10 月 18 日作者转告：杨俊、卞宏强已确认 D1–D8 和 2000 年规则（Y）</w:t>
       </w:r>
       <w:r>
         <w:rPr>
           <w:rFonts w:ascii="Calibri" w:cs="Calibri" w:eastAsia="Microsoft YaHei" w:hAnsi="Calibri"/>
         </w:rPr>
-        <w:t xml:space="preserve">。有异议的，在表里勾“异议”并写在备注，发给舒俊；全部同意后指南生效。</w:t>
+        <w:t xml:space="preserve">，同时确认了“Include 对 Pending IPD 算分歧”的读法（该读法写在指南第 10 节，不在本表）。确认的方式和日期没有说明，下面的签字栏没有收到，保持空白，需要纸面记录的话可以补签。</w:t>
       </w:r>
     </w:p>
     <w:tbl>

</xml_diff>

<commit_message>
Full-text stage: name corrected to 卞红强; hand-entry rule deleted; displaced spleen and unobtainable full text are excluded
Guide v2026-10-18b, decision sheet, workbook generator and regenerated
workbooks; CLAUDE.md logs the author's decisions.

Co-Authored-By: Claude Sonnet 5.5 <noreply@anthropic.com>
Claude-Session: https://claude.ai/code/session_01FRD7etKqYN8v2bbXeeLMRW
</commit_message>
<xml_diff>
--- a/Full-text screening - decision sheet D1-D8.docx
+++ b/Full-text screening - decision sheet D1-D8.docx
@@ -50,7 +50,7 @@
           <w:b/>
           <w:bCs/>
         </w:rPr>
-        <w:t xml:space="preserve">2026 年 10 月 18 日作者转告：杨俊、卞宏强已确认 D1–D8 和 2000 年规则（Y）</w:t>
+        <w:t xml:space="preserve">2026 年 10 月 18 日作者转告：杨俊、卞红强已确认 D1–D8 和 2000 年规则（Y）</w:t>
       </w:r>
       <w:r>
         <w:rPr>
@@ -370,7 +370,7 @@
                 <w:sz w:val="19"/>
                 <w:szCs w:val="19"/>
               </w:rPr>
-              <w:t xml:space="preserve">卞宏强 □</w:t>
+              <w:t xml:space="preserve">卞红强 □</w:t>
             </w:r>
           </w:p>
         </w:tc>
@@ -469,7 +469,7 @@
                 <w:sz w:val="19"/>
                 <w:szCs w:val="19"/>
               </w:rPr>
-              <w:t xml:space="preserve">卞宏强；筛选员 1 舒俊；仲裁杨俊。已注册方案里的第二评审员是彭飞，所以这也是偏离</w:t>
+              <w:t xml:space="preserve">卞红强；筛选员 1 舒俊；仲裁杨俊。已注册方案里的第二评审员是彭飞，所以这也是偏离</w:t>
             </w:r>
           </w:p>
         </w:tc>
@@ -526,7 +526,7 @@
                 <w:sz w:val="19"/>
                 <w:szCs w:val="19"/>
               </w:rPr>
-              <w:t xml:space="preserve">卞宏强 □</w:t>
+              <w:t xml:space="preserve">卞红强 □</w:t>
             </w:r>
           </w:p>
         </w:tc>
@@ -699,7 +699,7 @@
                 <w:sz w:val="19"/>
                 <w:szCs w:val="19"/>
               </w:rPr>
-              <w:t xml:space="preserve">卞宏强 □</w:t>
+              <w:t xml:space="preserve">卞红强 □</w:t>
             </w:r>
           </w:p>
         </w:tc>
@@ -855,7 +855,7 @@
                 <w:sz w:val="19"/>
                 <w:szCs w:val="19"/>
               </w:rPr>
-              <w:t xml:space="preserve">卞宏强 □</w:t>
+              <w:t xml:space="preserve">卞红强 □</w:t>
             </w:r>
           </w:p>
         </w:tc>
@@ -1011,7 +1011,7 @@
                 <w:sz w:val="19"/>
                 <w:szCs w:val="19"/>
               </w:rPr>
-              <w:t xml:space="preserve">卞宏强 □</w:t>
+              <w:t xml:space="preserve">卞红强 □</w:t>
             </w:r>
           </w:p>
         </w:tc>
@@ -1167,7 +1167,7 @@
                 <w:sz w:val="19"/>
                 <w:szCs w:val="19"/>
               </w:rPr>
-              <w:t xml:space="preserve">卞宏强 □</w:t>
+              <w:t xml:space="preserve">卞红强 □</w:t>
             </w:r>
           </w:p>
         </w:tc>
@@ -1323,7 +1323,7 @@
                 <w:sz w:val="19"/>
                 <w:szCs w:val="19"/>
               </w:rPr>
-              <w:t xml:space="preserve">卞宏强 □</w:t>
+              <w:t xml:space="preserve">卞红强 □</w:t>
             </w:r>
           </w:p>
         </w:tc>
@@ -1479,7 +1479,7 @@
                 <w:sz w:val="19"/>
                 <w:szCs w:val="19"/>
               </w:rPr>
-              <w:t xml:space="preserve">卞宏强 □</w:t>
+              <w:t xml:space="preserve">卞红强 □</w:t>
             </w:r>
           </w:p>
         </w:tc>
@@ -1635,7 +1635,7 @@
                 <w:sz w:val="19"/>
                 <w:szCs w:val="19"/>
               </w:rPr>
-              <w:t xml:space="preserve">卞宏强 □</w:t>
+              <w:t xml:space="preserve">卞红强 □</w:t>
             </w:r>
           </w:p>
         </w:tc>
@@ -1791,7 +1791,7 @@
                 <w:sz w:val="19"/>
                 <w:szCs w:val="19"/>
               </w:rPr>
-              <w:t xml:space="preserve">卞宏强 □</w:t>
+              <w:t xml:space="preserve">卞红强 □</w:t>
             </w:r>
           </w:p>
         </w:tc>
@@ -1821,7 +1821,7 @@
         <w:rPr>
           <w:rFonts w:ascii="Calibri" w:cs="Calibri" w:eastAsia="Microsoft YaHei" w:hAnsi="Calibri"/>
         </w:rPr>
-        <w:t xml:space="preserve">签名和日期（舒俊）：　　　　（杨俊）：　　　　（卞宏强）：</w:t>
+        <w:t xml:space="preserve">签名和日期（舒俊）：　　　　（杨俊）：　　　　（卞红强）：</w:t>
       </w:r>
     </w:p>
     <w:sectPr>

</xml_diff>

<commit_message>
Drop the full-text time log (FT_time_log): scripts, workbooks, guide, protocol v1.6, manuscript draft
The change is stated as a fact only; no reason has been given by the author.

Co-Authored-By: Claude Sonnet 5.5 <noreply@anthropic.com>
Claude-Session: https://claude.ai/code/session_01FRD7etKqYN8v2bbXeeLMRW
</commit_message>
<xml_diff>
--- a/Full-text screening - decision sheet D1-D8.docx
+++ b/Full-text screening - decision sheet D1-D8.docx
@@ -1822,6 +1822,17 @@
           <w:rFonts w:ascii="Calibri" w:cs="Calibri" w:eastAsia="Microsoft YaHei" w:hAnsi="Calibri"/>
         </w:rPr>
         <w:t xml:space="preserve">签名和日期（舒俊）：　　　　（杨俊）：　　　　（卞红强）：</w:t>
+      </w:r>
+    </w:p>
+    <w:p>
+      <w:pPr>
+        <w:spacing w:after="120"/>
+      </w:pPr>
+      <w:r>
+        <w:rPr>
+          <w:rFonts w:ascii="Calibri" w:cs="Calibri" w:eastAsia="Microsoft YaHei" w:hAnsi="Calibri"/>
+        </w:rPr>
+        <w:t xml:space="preserve">2026 年 10 月 19 日补记（不属于上表已确认的内容）：作者决定全文阶段不再保存 FT_time_log（D4 里“FT_time_log 记每次起止时间”一项作废，其余各项不变）。杨俊和卞红强是否知道，作者尚未说明。</w:t>
       </w:r>
     </w:p>
     <w:sectPr>

</xml_diff>